<commit_message>
Creación nuevos campos cliente y entrenador
</commit_message>
<xml_diff>
--- a/backend/library/Organización de la aplicación.docx
+++ b/backend/library/Organización de la aplicación.docx
@@ -28,52 +28,18 @@
     </w:p>
     <w:p>
       <w:r>
-        <w:t xml:space="preserve">Usuario: nombre y </w:t>
-      </w:r>
-      <w:proofErr w:type="gramStart"/>
-      <w:r>
-        <w:t>apellidos ,</w:t>
-      </w:r>
-      <w:proofErr w:type="gramEnd"/>
-      <w:r>
-        <w:t xml:space="preserve"> email, id , contraseña</w:t>
-      </w:r>
-    </w:p>
-    <w:p>
-      <w:r>
-        <w:t xml:space="preserve">Entrenador: email, nombre y apellidos, </w:t>
-      </w:r>
-      <w:proofErr w:type="gramStart"/>
-      <w:r>
-        <w:t>id ,</w:t>
-      </w:r>
-      <w:proofErr w:type="gramEnd"/>
-      <w:r>
-        <w:t xml:space="preserve"> </w:t>
-      </w:r>
-      <w:proofErr w:type="spellStart"/>
-      <w:r>
-        <w:t>especialidad,CodigoEntrenador</w:t>
-      </w:r>
-      <w:proofErr w:type="spellEnd"/>
-    </w:p>
-    <w:p>
-      <w:r>
-        <w:t xml:space="preserve">Cliente: </w:t>
-      </w:r>
-      <w:proofErr w:type="gramStart"/>
-      <w:r>
-        <w:t>id ,</w:t>
-      </w:r>
-      <w:proofErr w:type="gramEnd"/>
-      <w:r>
-        <w:t xml:space="preserve"> nombre y apellidos, id, peso, altura, edad , objetivo, </w:t>
-      </w:r>
-      <w:proofErr w:type="spellStart"/>
-      <w:r>
-        <w:t>CodigoUnico</w:t>
-      </w:r>
-      <w:proofErr w:type="spellEnd"/>
+        <w:t>Usuario: nombre y apellidos , email, id , contraseña</w:t>
+      </w:r>
+    </w:p>
+    <w:p>
+      <w:r>
+        <w:t>Entrenador: email, nombre y apellidos, id , especialidad,CodigoEntrenador</w:t>
+      </w:r>
+    </w:p>
+    <w:p>
+      <w:r>
+        <w:t>Cliente: id , nombre y apellidos, id, peso, altura, edad , objetivo, CodigoUnico</w:t>
+      </w:r>
     </w:p>
     <w:p>
       <w:r>
@@ -82,6 +48,9 @@
     </w:p>
     <w:p>
       <w:r>
+        <w:rPr>
+          <w:noProof/>
+        </w:rPr>
         <w:drawing>
           <wp:inline distT="0" distB="0" distL="0" distR="0" wp14:anchorId="09FAAA9E" wp14:editId="0173FB52">
             <wp:extent cx="4732020" cy="1685476"/>
@@ -188,15 +157,7 @@
         </w:numPr>
       </w:pPr>
       <w:r>
-        <w:t xml:space="preserve">puede editar su </w:t>
-      </w:r>
-      <w:proofErr w:type="gramStart"/>
-      <w:r>
-        <w:t>perfil(</w:t>
-      </w:r>
-      <w:proofErr w:type="gramEnd"/>
-      <w:r>
-        <w:t>nombre, foto, datos)</w:t>
+        <w:t>puede editar su perfil(nombre, foto, datos)</w:t>
       </w:r>
     </w:p>
     <w:p>
@@ -231,15 +192,7 @@
         </w:numPr>
       </w:pPr>
       <w:r>
-        <w:t xml:space="preserve">Invitar a un cliente a un grupo privado para poder poner sus </w:t>
-      </w:r>
-      <w:proofErr w:type="spellStart"/>
-      <w:r>
-        <w:t>entrenaiemtos</w:t>
-      </w:r>
-      <w:proofErr w:type="spellEnd"/>
-      <w:r>
-        <w:t xml:space="preserve"> generando un código único</w:t>
+        <w:t>Invitar a un cliente a un grupo privado para poder poner sus entrenaiemtos generando un código único</w:t>
       </w:r>
     </w:p>
     <w:p>
@@ -268,15 +221,7 @@
     </w:p>
     <w:p>
       <w:r>
-        <w:t xml:space="preserve">Debe haber un chat donde se puedan comunicar tanto </w:t>
-      </w:r>
-      <w:proofErr w:type="spellStart"/>
-      <w:r>
-        <w:t>cliete</w:t>
-      </w:r>
-      <w:proofErr w:type="spellEnd"/>
-      <w:r>
-        <w:t xml:space="preserve"> como entrenador.</w:t>
+        <w:t>Debe haber un chat donde se puedan comunicar tanto cliete como entrenador.</w:t>
       </w:r>
     </w:p>
     <w:p>
@@ -457,23 +402,7 @@
           <w:b/>
           <w:bCs/>
         </w:rPr>
-        <w:t xml:space="preserve">Integración con dispositivos y </w:t>
-      </w:r>
-      <w:proofErr w:type="gramStart"/>
-      <w:r>
-        <w:rPr>
-          <w:b/>
-          <w:bCs/>
-        </w:rPr>
-        <w:t>apps</w:t>
-      </w:r>
-      <w:proofErr w:type="gramEnd"/>
-      <w:r>
-        <w:rPr>
-          <w:b/>
-          <w:bCs/>
-        </w:rPr>
-        <w:t xml:space="preserve"> de fitness:</w:t>
+        <w:t>Integración con dispositivos y apps de fitness:</w:t>
       </w:r>
     </w:p>
     <w:p>
@@ -487,23 +416,7 @@
         </w:tabs>
       </w:pPr>
       <w:r>
-        <w:t xml:space="preserve">Conexión con Google </w:t>
-      </w:r>
-      <w:proofErr w:type="spellStart"/>
-      <w:r>
-        <w:t>Fit</w:t>
-      </w:r>
-      <w:proofErr w:type="spellEnd"/>
-      <w:r>
-        <w:t xml:space="preserve">, Apple </w:t>
-      </w:r>
-      <w:proofErr w:type="spellStart"/>
-      <w:r>
-        <w:t>Health</w:t>
-      </w:r>
-      <w:proofErr w:type="spellEnd"/>
-      <w:r>
-        <w:t>, Fitbit, etc., para registrar métricas automáticamente.</w:t>
+        <w:t>Conexión con Google Fit, Apple Health, Fitbit, etc., para registrar métricas automáticamente.</w:t>
       </w:r>
     </w:p>
     <w:p>
@@ -621,6 +534,252 @@
           <w:tab w:val="left" w:pos="1572"/>
         </w:tabs>
       </w:pPr>
+    </w:p>
+    <w:p>
+      <w:pPr>
+        <w:tabs>
+          <w:tab w:val="left" w:pos="1572"/>
+        </w:tabs>
+      </w:pPr>
+    </w:p>
+    <w:p>
+      <w:pPr>
+        <w:tabs>
+          <w:tab w:val="left" w:pos="1572"/>
+        </w:tabs>
+      </w:pPr>
+    </w:p>
+    <w:p>
+      <w:pPr>
+        <w:tabs>
+          <w:tab w:val="left" w:pos="1572"/>
+        </w:tabs>
+      </w:pPr>
+    </w:p>
+    <w:p>
+      <w:pPr>
+        <w:tabs>
+          <w:tab w:val="left" w:pos="1572"/>
+        </w:tabs>
+      </w:pPr>
+    </w:p>
+    <w:p>
+      <w:pPr>
+        <w:tabs>
+          <w:tab w:val="left" w:pos="1572"/>
+        </w:tabs>
+      </w:pPr>
+    </w:p>
+    <w:p>
+      <w:pPr>
+        <w:tabs>
+          <w:tab w:val="left" w:pos="1572"/>
+        </w:tabs>
+      </w:pPr>
+    </w:p>
+    <w:p>
+      <w:pPr>
+        <w:tabs>
+          <w:tab w:val="left" w:pos="1572"/>
+        </w:tabs>
+      </w:pPr>
+      <w:r>
+        <w:lastRenderedPageBreak/>
+        <w:t xml:space="preserve">OBJETIVOS CLIENTE </w:t>
+      </w:r>
+    </w:p>
+    <w:p>
+      <w:pPr>
+        <w:tabs>
+          <w:tab w:val="left" w:pos="1572"/>
+        </w:tabs>
+      </w:pPr>
+      <w:r>
+        <w:rPr>
+          <w:noProof/>
+        </w:rPr>
+        <w:drawing>
+          <wp:inline distT="0" distB="0" distL="0" distR="0" wp14:anchorId="0FF0BFCD" wp14:editId="43253872">
+            <wp:extent cx="5400040" cy="3022600"/>
+            <wp:effectExtent l="0" t="0" r="0" b="6350"/>
+            <wp:docPr id="2117710363" name="Imagen 1"/>
+            <wp:cNvGraphicFramePr>
+              <a:graphicFrameLocks xmlns:a="http://schemas.openxmlformats.org/drawingml/2006/main" noChangeAspect="1"/>
+            </wp:cNvGraphicFramePr>
+            <a:graphic xmlns:a="http://schemas.openxmlformats.org/drawingml/2006/main">
+              <a:graphicData uri="http://schemas.openxmlformats.org/drawingml/2006/picture">
+                <pic:pic xmlns:pic="http://schemas.openxmlformats.org/drawingml/2006/picture">
+                  <pic:nvPicPr>
+                    <pic:cNvPr id="2117710363" name=""/>
+                    <pic:cNvPicPr/>
+                  </pic:nvPicPr>
+                  <pic:blipFill>
+                    <a:blip r:embed="rId6"/>
+                    <a:stretch>
+                      <a:fillRect/>
+                    </a:stretch>
+                  </pic:blipFill>
+                  <pic:spPr>
+                    <a:xfrm>
+                      <a:off x="0" y="0"/>
+                      <a:ext cx="5400040" cy="3022600"/>
+                    </a:xfrm>
+                    <a:prstGeom prst="rect">
+                      <a:avLst/>
+                    </a:prstGeom>
+                  </pic:spPr>
+                </pic:pic>
+              </a:graphicData>
+            </a:graphic>
+          </wp:inline>
+        </w:drawing>
+      </w:r>
+    </w:p>
+    <w:p>
+      <w:pPr>
+        <w:tabs>
+          <w:tab w:val="left" w:pos="1572"/>
+        </w:tabs>
+      </w:pPr>
+    </w:p>
+    <w:p>
+      <w:pPr>
+        <w:tabs>
+          <w:tab w:val="left" w:pos="1572"/>
+        </w:tabs>
+      </w:pPr>
+      <w:r>
+        <w:t xml:space="preserve">Nos hemos dado cuenta </w:t>
+      </w:r>
+      <w:proofErr w:type="gramStart"/>
+      <w:r>
+        <w:t>que</w:t>
+      </w:r>
+      <w:proofErr w:type="gramEnd"/>
+      <w:r>
+        <w:t xml:space="preserve"> necesitamos mas </w:t>
+      </w:r>
+      <w:proofErr w:type="gramStart"/>
+      <w:r>
+        <w:t>campos .</w:t>
+      </w:r>
+      <w:proofErr w:type="gramEnd"/>
+    </w:p>
+    <w:p>
+      <w:pPr>
+        <w:tabs>
+          <w:tab w:val="left" w:pos="1572"/>
+        </w:tabs>
+      </w:pPr>
+      <w:r>
+        <w:t>A parte esos campos se van a rellenar una vez nos hayamos registrado, no en el propio registro.</w:t>
+      </w:r>
+    </w:p>
+    <w:p>
+      <w:pPr>
+        <w:tabs>
+          <w:tab w:val="left" w:pos="1572"/>
+        </w:tabs>
+      </w:pPr>
+      <w:r>
+        <w:t xml:space="preserve">Cliente: apellido, genero, </w:t>
+      </w:r>
+      <w:proofErr w:type="spellStart"/>
+      <w:proofErr w:type="gramStart"/>
+      <w:r>
+        <w:t>altura,peso</w:t>
+      </w:r>
+      <w:proofErr w:type="gramEnd"/>
+      <w:r>
+        <w:t>,objetivo</w:t>
+      </w:r>
+      <w:proofErr w:type="spellEnd"/>
+    </w:p>
+    <w:p>
+      <w:pPr>
+        <w:tabs>
+          <w:tab w:val="left" w:pos="1572"/>
+        </w:tabs>
+      </w:pPr>
+    </w:p>
+    <w:p>
+      <w:pPr>
+        <w:tabs>
+          <w:tab w:val="left" w:pos="1572"/>
+        </w:tabs>
+      </w:pPr>
+      <w:r>
+        <w:t>Hacer entrenamientos base ya hechos por defecto</w:t>
+      </w:r>
+    </w:p>
+    <w:p>
+      <w:pPr>
+        <w:tabs>
+          <w:tab w:val="left" w:pos="1572"/>
+        </w:tabs>
+      </w:pPr>
+      <w:r>
+        <w:t xml:space="preserve">Hacer un sistema para que los usuarios puedan conectar con sus amigos y poder ver las marcas de cada uno </w:t>
+      </w:r>
+    </w:p>
+    <w:p>
+      <w:pPr>
+        <w:tabs>
+          <w:tab w:val="left" w:pos="1572"/>
+        </w:tabs>
+      </w:pPr>
+      <w:r>
+        <w:t>Cada usuario puede crear su entrenamiento propio</w:t>
+      </w:r>
+    </w:p>
+    <w:p>
+      <w:pPr>
+        <w:tabs>
+          <w:tab w:val="left" w:pos="1572"/>
+        </w:tabs>
+      </w:pPr>
+      <w:r>
+        <w:t>Tiene que haber una opción que sea buscar entrenador en la que por el objetivo que quieras conseguir puedas buscar a entrenadores recomendados o buscar a un propio entrenador tu.</w:t>
+      </w:r>
+    </w:p>
+    <w:p>
+      <w:pPr>
+        <w:tabs>
+          <w:tab w:val="left" w:pos="1572"/>
+        </w:tabs>
+      </w:pPr>
+      <w:r>
+        <w:t xml:space="preserve">El entrenador tendrá un apartado propio con cada </w:t>
+      </w:r>
+      <w:proofErr w:type="gramStart"/>
+      <w:r>
+        <w:t>cliente ,</w:t>
+      </w:r>
+      <w:proofErr w:type="gramEnd"/>
+      <w:r>
+        <w:t xml:space="preserve"> en el que haya un chat y pueda ponerle o hacerle entrenamientos </w:t>
+      </w:r>
+      <w:proofErr w:type="gramStart"/>
+      <w:r>
+        <w:t xml:space="preserve">personalizados </w:t>
+      </w:r>
+      <w:r>
+        <w:t>,</w:t>
+      </w:r>
+      <w:proofErr w:type="gramEnd"/>
+      <w:r>
+        <w:t xml:space="preserve"> que luego el cliente pueda ver y modificar.</w:t>
+      </w:r>
+    </w:p>
+    <w:p>
+      <w:pPr>
+        <w:tabs>
+          <w:tab w:val="left" w:pos="1572"/>
+        </w:tabs>
+      </w:pPr>
+      <w:r>
+        <w:t>El cliente si no tiene contratado a ningún entrenador solo puede ver la opción de entrenamientos por defecto , crear mi propio entrenamiento , si tiene algún entrenador contratado que haya otro apartado que sea mis entrenamientos con x entrenador.</w:t>
+      </w:r>
     </w:p>
     <w:sectPr>
       <w:pgSz w:w="11906" w:h="16838"/>
@@ -2232,6 +2391,7 @@
   <w:style w:type="character" w:default="1" w:styleId="Fuentedeprrafopredeter">
     <w:name w:val="Default Paragraph Font"/>
     <w:uiPriority w:val="1"/>
+    <w:semiHidden/>
     <w:unhideWhenUsed/>
   </w:style>
   <w:style w:type="table" w:default="1" w:styleId="Tablanormal">

</xml_diff>